<commit_message>
docs(orgcomp): cite FedRAMP's actual PAIN-rating SLA model in Books 03/06/07
"SLA class keyed to KEV/exposure" was gesturing at CISA BOD 26-04 without
citing what FedRAMP actually specifies. FedRAMP's Vulnerability Detection
and Response ruleset (VDR-TFR-PVR) names a concrete model — remediation
timeframes by Potential Agency Impact (PAIN) rating crossed with
exploitability and internet-reachability, 4 to 192 days depending on the
cell. Replace the vague "four-variable model" phrasing with the actual
table in all three CSP books' Engine 2/3 sections and References, and
fix two more stale "OCI and VMware" cross-references in Book 06 that
should have been updated when Book 07 shipped.

Co-Authored-By: Claude Sonnet 5 <noreply@anthropic.com>
</commit_message>
<xml_diff>
--- a/docs/customer-documents/orgcomp-series/Vol_VII_Book_03_OrgComp_Azure_Control_Compliance_Automation.docx
+++ b/docs/customer-documents/orgcomp-series/Vol_VII_Book_03_OrgComp_Azure_Control_Compliance_Automation.docx
@@ -7,7 +7,7 @@
         <w:pStyle w:val="Title"/>
       </w:pPr>
       <w:r>
-        <w:t xml:space="preserve">Vol VII Book 03 — Federal Application-Aware Networking — Azure Federal Control Compliance Automation</w:t>
+        <w:t xml:space="preserve">Vol VII Book 03 — Federal Organization Compliance — Azure Federal Control Compliance Automation</w:t>
       </w:r>
     </w:p>
     <w:p>
@@ -23,7 +23,7 @@
         <w:pStyle w:val="Author"/>
       </w:pPr>
       <w:r>
-        <w:t xml:space="preserve">SSA Cloud Services Team</w:t>
+        <w:t xml:space="preserve">Federal Cloud Services</w:t>
       </w:r>
     </w:p>
     <w:p>
@@ -31,7 +31,7 @@
         <w:pStyle w:val="Date"/>
       </w:pPr>
       <w:r>
-        <w:t xml:space="preserve">2026-07-12 15:00 ET</w:t>
+        <w:t xml:space="preserve">2026-07-28 08:45 ET</w:t>
       </w:r>
     </w:p>
     <w:p>
@@ -69,7 +69,7 @@
         <w:t xml:space="preserve">CSI Team (Cloud Services Infrastructure)</w:t>
       </w:r>
       <w:r>
-        <w:t xml:space="preserve">; not yet reviewed or approved by the SSA CIO Office, OIS, or leadership.</w:t>
+        <w:t xml:space="preserve">; not yet reviewed or approved by the {{&lt; meta agency.short &gt;}} CIO Office, OIS, or leadership.</w:t>
       </w:r>
       <w:r>
         <w:t xml:space="preserve"> </w:t>
@@ -85,7 +85,7 @@
         <w:t xml:space="preserve"> </w:t>
       </w:r>
       <w:r>
-        <w:t xml:space="preserve">2026-07-12 15:00 ET</w:t>
+        <w:t xml:space="preserve">2026-07-28 08:45 ET</w:t>
       </w:r>
     </w:p>
     <w:bookmarkEnd w:id="9"/>
@@ -517,13 +517,13 @@
           <w:b/>
           <w:bCs/>
         </w:rPr>
-        <w:t xml:space="preserve">Other CSPs (AWS, OCI, VMware) reconcile into the same ServiceNow SI-2 queue in a later follow-up</w:t>
-      </w:r>
-      <w:r>
-        <w:t xml:space="preserve"> </w:t>
-      </w:r>
-      <w:r>
-        <w:t xml:space="preserve">(their native stacks are catalogued in Vol III Book 03); ServiceNow already coordinates a single queue, so adding those surfaces later needs no rework here.</w:t>
+        <w:t xml:space="preserve">AWS’s own engines are covered in Vol VII Book 06, VMware’s in Vol VII Book 07; OCI reconciles into the same ServiceNow SI-2 queue in a later follow-up</w:t>
+      </w:r>
+      <w:r>
+        <w:t xml:space="preserve"> </w:t>
+      </w:r>
+      <w:r>
+        <w:t xml:space="preserve">(its native stack is catalogued in Vol III Book 03); ServiceNow already coordinates a single queue, so adding that surface later needs no rework here.</w:t>
       </w:r>
     </w:p>
     <w:bookmarkEnd w:id="15"/>
@@ -739,7 +739,7 @@
         <w:t xml:space="preserve"> </w:t>
       </w:r>
       <w:r>
-        <w:t xml:space="preserve">task against the reconciled CI, with a severity and an SLA class derived from exposure and KEV status — the risk-based prioritization CISA BOD 22-01 and the four-variable model (BOD 26-04) call for.</w:t>
+        <w:t xml:space="preserve">task against the reconciled CI, with a severity and an SLA class derived from exposure and KEV status — the risk-based prioritization CISA BOD 22-01 and the PAIN-rating model (BOD 26-04; FedRAMP VDR-TFR-PVR) call for, detailed under Control Engine 3 below.</w:t>
       </w:r>
     </w:p>
     <w:p>
@@ -877,7 +877,7 @@
         <w:t xml:space="preserve"> </w:t>
       </w:r>
       <w:r>
-        <w:t xml:space="preserve">(an out-of-cycle KEV exposure), with an SLA class keyed to KEV/exposure — the BOD 26-04 model. The same SLA discipline is what other-CSP patch queues will reconcile into when they are added later (Vol III Book 03).</w:t>
+        <w:t xml:space="preserve">(an out-of-cycle KEV exposure), with an SLA class keyed to KEV/exposure — the PAIN-rating model (BOD 26-04; FedRAMP VDR-TFR-PVR), detailed below. The same SLA discipline is what other-CSP patch queues will reconcile into when they are added later (Vol III Book 03).</w:t>
       </w:r>
     </w:p>
     <w:p>
@@ -933,6 +933,305 @@
           <w:b/>
           <w:bCs/>
         </w:rPr>
+        <w:t xml:space="preserve">“SLA by exposure”</w:t>
+      </w:r>
+      <w:r>
+        <w:rPr>
+          <w:b/>
+          <w:bCs/>
+        </w:rPr>
+        <w:t xml:space="preserve"> </w:t>
+      </w:r>
+      <w:r>
+        <w:rPr>
+          <w:b/>
+          <w:bCs/>
+        </w:rPr>
+        <w:t xml:space="preserve">has a name and a published table — the Potential Agency Impact (PAIN) rating.</w:t>
+      </w:r>
+      <w:r>
+        <w:t xml:space="preserve"> </w:t>
+      </w:r>
+      <w:r>
+        <w:t xml:space="preserve">FedRAMP’s Vulnerability Detection and Response ruleset (VDR-TFR-PVR) sets mitigation/remediation timeframes by PAIN rating crossed with exploitability and internet-reachability:</w:t>
+      </w:r>
+    </w:p>
+    <w:tbl>
+      <w:tblPr>
+        <w:tblStyle w:val="Table"/>
+        <w:tblW w:type="pct" w:w="5000"/>
+        <w:tblLayout w:type="fixed"/>
+        <w:tblLook w:firstRow="1" w:lastRow="0" w:firstColumn="0" w:lastColumn="0" w:noHBand="0" w:noVBand="0" w:val="0020"/>
+      </w:tblPr>
+      <w:tblGrid>
+        <w:gridCol w:w="1980"/>
+        <w:gridCol w:w="1980"/>
+        <w:gridCol w:w="1980"/>
+        <w:gridCol w:w="1980"/>
+      </w:tblGrid>
+      <w:tr>
+        <w:trPr>
+          <w:tblHeader w:val="on"/>
+        </w:trPr>
+        <w:tc>
+          <w:tcPr/>
+          <w:p>
+            <w:pPr>
+              <w:pStyle w:val="Compact"/>
+            </w:pPr>
+            <w:r>
+              <w:t xml:space="preserve">PAIN rating</w:t>
+            </w:r>
+          </w:p>
+        </w:tc>
+        <w:tc>
+          <w:tcPr/>
+          <w:p>
+            <w:pPr>
+              <w:pStyle w:val="Compact"/>
+            </w:pPr>
+            <w:r>
+              <w:t xml:space="preserve">Likely-exploitable, internet-reachable</w:t>
+            </w:r>
+          </w:p>
+        </w:tc>
+        <w:tc>
+          <w:tcPr/>
+          <w:p>
+            <w:pPr>
+              <w:pStyle w:val="Compact"/>
+            </w:pPr>
+            <w:r>
+              <w:t xml:space="preserve">Likely-exploitable, not internet-reachable</w:t>
+            </w:r>
+          </w:p>
+        </w:tc>
+        <w:tc>
+          <w:tcPr/>
+          <w:p>
+            <w:pPr>
+              <w:pStyle w:val="Compact"/>
+            </w:pPr>
+            <w:r>
+              <w:t xml:space="preserve">Not likely exploitable</w:t>
+            </w:r>
+          </w:p>
+        </w:tc>
+      </w:tr>
+      <w:tr>
+        <w:tc>
+          <w:tcPr/>
+          <w:p>
+            <w:pPr>
+              <w:pStyle w:val="Compact"/>
+            </w:pPr>
+            <w:r>
+              <w:t xml:space="preserve">PAIN-5</w:t>
+            </w:r>
+          </w:p>
+        </w:tc>
+        <w:tc>
+          <w:tcPr/>
+          <w:p>
+            <w:pPr>
+              <w:pStyle w:val="Compact"/>
+            </w:pPr>
+            <w:r>
+              <w:t xml:space="preserve">4 days</w:t>
+            </w:r>
+          </w:p>
+        </w:tc>
+        <w:tc>
+          <w:tcPr/>
+          <w:p>
+            <w:pPr>
+              <w:pStyle w:val="Compact"/>
+            </w:pPr>
+            <w:r>
+              <w:t xml:space="preserve">8 days</w:t>
+            </w:r>
+          </w:p>
+        </w:tc>
+        <w:tc>
+          <w:tcPr/>
+          <w:p>
+            <w:pPr>
+              <w:pStyle w:val="Compact"/>
+            </w:pPr>
+            <w:r>
+              <w:t xml:space="preserve">32 days</w:t>
+            </w:r>
+          </w:p>
+        </w:tc>
+      </w:tr>
+      <w:tr>
+        <w:tc>
+          <w:tcPr/>
+          <w:p>
+            <w:pPr>
+              <w:pStyle w:val="Compact"/>
+            </w:pPr>
+            <w:r>
+              <w:t xml:space="preserve">PAIN-4</w:t>
+            </w:r>
+          </w:p>
+        </w:tc>
+        <w:tc>
+          <w:tcPr/>
+          <w:p>
+            <w:pPr>
+              <w:pStyle w:val="Compact"/>
+            </w:pPr>
+            <w:r>
+              <w:t xml:space="preserve">8 days</w:t>
+            </w:r>
+          </w:p>
+        </w:tc>
+        <w:tc>
+          <w:tcPr/>
+          <w:p>
+            <w:pPr>
+              <w:pStyle w:val="Compact"/>
+            </w:pPr>
+            <w:r>
+              <w:t xml:space="preserve">32 days</w:t>
+            </w:r>
+          </w:p>
+        </w:tc>
+        <w:tc>
+          <w:tcPr/>
+          <w:p>
+            <w:pPr>
+              <w:pStyle w:val="Compact"/>
+            </w:pPr>
+            <w:r>
+              <w:t xml:space="preserve">64 days</w:t>
+            </w:r>
+          </w:p>
+        </w:tc>
+      </w:tr>
+      <w:tr>
+        <w:tc>
+          <w:tcPr/>
+          <w:p>
+            <w:pPr>
+              <w:pStyle w:val="Compact"/>
+            </w:pPr>
+            <w:r>
+              <w:t xml:space="preserve">PAIN-3</w:t>
+            </w:r>
+          </w:p>
+        </w:tc>
+        <w:tc>
+          <w:tcPr/>
+          <w:p>
+            <w:pPr>
+              <w:pStyle w:val="Compact"/>
+            </w:pPr>
+            <w:r>
+              <w:t xml:space="preserve">32 days</w:t>
+            </w:r>
+          </w:p>
+        </w:tc>
+        <w:tc>
+          <w:tcPr/>
+          <w:p>
+            <w:pPr>
+              <w:pStyle w:val="Compact"/>
+            </w:pPr>
+            <w:r>
+              <w:t xml:space="preserve">64 days</w:t>
+            </w:r>
+          </w:p>
+        </w:tc>
+        <w:tc>
+          <w:tcPr/>
+          <w:p>
+            <w:pPr>
+              <w:pStyle w:val="Compact"/>
+            </w:pPr>
+            <w:r>
+              <w:t xml:space="preserve">192 days</w:t>
+            </w:r>
+          </w:p>
+        </w:tc>
+      </w:tr>
+      <w:tr>
+        <w:tc>
+          <w:tcPr/>
+          <w:p>
+            <w:pPr>
+              <w:pStyle w:val="Compact"/>
+            </w:pPr>
+            <w:r>
+              <w:t xml:space="preserve">PAIN-2</w:t>
+            </w:r>
+          </w:p>
+        </w:tc>
+        <w:tc>
+          <w:tcPr/>
+          <w:p>
+            <w:pPr>
+              <w:pStyle w:val="Compact"/>
+            </w:pPr>
+            <w:r>
+              <w:t xml:space="preserve">96 days</w:t>
+            </w:r>
+          </w:p>
+        </w:tc>
+        <w:tc>
+          <w:tcPr/>
+          <w:p>
+            <w:pPr>
+              <w:pStyle w:val="Compact"/>
+            </w:pPr>
+            <w:r>
+              <w:t xml:space="preserve">160 days</w:t>
+            </w:r>
+          </w:p>
+        </w:tc>
+        <w:tc>
+          <w:tcPr/>
+          <w:p>
+            <w:pPr>
+              <w:pStyle w:val="Compact"/>
+            </w:pPr>
+            <w:r>
+              <w:t xml:space="preserve">192 days</w:t>
+            </w:r>
+          </w:p>
+        </w:tc>
+      </w:tr>
+    </w:tbl>
+    <w:p>
+      <w:pPr>
+        <w:pStyle w:val="CalloutNote"/>
+      </w:pPr>
+      <w:r>
+        <w:t xml:space="preserve">A CISA-catalogued KEV must be remediated by the KEV catalog’s own due date regardless of PAIN rating (VDR-TFR-KEV), even after full mitigation. These are the actual numbers a ServiceNow SLA-class task should encode —</w:t>
+      </w:r>
+      <w:r>
+        <w:t xml:space="preserve"> </w:t>
+      </w:r>
+      <w:r>
+        <w:t xml:space="preserve">“SLA by exposure”</w:t>
+      </w:r>
+      <w:r>
+        <w:t xml:space="preserve"> </w:t>
+      </w:r>
+      <w:r>
+        <w:t xml:space="preserve">is this table, not a general-purpose severity field.</w:t>
+      </w:r>
+    </w:p>
+    <w:p>
+      <w:pPr>
+        <w:pStyle w:val="CalloutNote"/>
+      </w:pPr>
+      <w:r>
+        <w:rPr>
+          <w:b/>
+          <w:bCs/>
+        </w:rPr>
         <w:t xml:space="preserve">Scan is not remediation, and remediation is not the record.</w:t>
       </w:r>
       <w:r>
@@ -1082,7 +1381,7 @@
         <w:rPr>
           <w:rStyle w:val="VerbatimChar"/>
         </w:rPr>
-        <w:t xml:space="preserve">aan-compliance-spine.yml</w:t>
+        <w:t xml:space="preserve">orgcomp-compliance-spine.yml</w:t>
       </w:r>
       <w:r>
         <w:t xml:space="preserve">) by</w:t>
@@ -1719,7 +2018,7 @@
       </w:r>
     </w:p>
     <w:bookmarkEnd w:id="25"/>
-    <w:bookmarkStart w:id="31" w:name="references"/>
+    <w:bookmarkStart w:id="32" w:name="references"/>
     <w:p>
       <w:pPr>
         <w:pStyle w:val="Heading1"/>
@@ -1914,7 +2213,7 @@
               <w:pStyle w:val="Compact"/>
             </w:pPr>
             <w:r>
-              <w:t xml:space="preserve">Risk-based remediation prioritization (KEV; four-variable model)</w:t>
+              <w:t xml:space="preserve">Risk-based remediation prioritization (KEV catalog)</w:t>
             </w:r>
           </w:p>
         </w:tc>
@@ -1949,6 +2248,41 @@
               <w:pStyle w:val="Compact"/>
             </w:pPr>
             <w:r>
+              <w:t xml:space="preserve">PAIN-rating remediation timeframes (VDR-TFR-PVR)</w:t>
+            </w:r>
+          </w:p>
+        </w:tc>
+        <w:tc>
+          <w:tcPr/>
+          <w:p>
+            <w:pPr>
+              <w:pStyle w:val="Compact"/>
+            </w:pPr>
+            <w:r>
+              <w:t xml:space="preserve">FedRAMP —</w:t>
+            </w:r>
+            <w:r>
+              <w:t xml:space="preserve"> </w:t>
+            </w:r>
+            <w:hyperlink r:id="rId31">
+              <w:r>
+                <w:rPr>
+                  <w:rStyle w:val="Hyperlink"/>
+                </w:rPr>
+                <w:t xml:space="preserve">https://www.fedramp.gov/2026/reference/vulnerability-detection-and-response/</w:t>
+              </w:r>
+            </w:hyperlink>
+          </w:p>
+        </w:tc>
+      </w:tr>
+      <w:tr>
+        <w:tc>
+          <w:tcPr/>
+          <w:p>
+            <w:pPr>
+              <w:pStyle w:val="Compact"/>
+            </w:pPr>
+            <w:r>
               <w:t xml:space="preserve">ServiceNow as workflow/CMDB/evidence coordination hub</w:t>
             </w:r>
           </w:p>
@@ -1969,13 +2303,13 @@
               <w:rPr>
                 <w:rStyle w:val="VerbatimChar"/>
               </w:rPr>
-              <w:t xml:space="preserve">inbox/Application Aware Networking/AAN_Series_Expansion_Plan_Substrate_Accreditation.md</w:t>
+              <w:t xml:space="preserve">docs/customer-documents/orgcomp-series/OrgComp_Series_Expansion_Plan_Substrate_Accreditation.md</w:t>
             </w:r>
           </w:p>
         </w:tc>
       </w:tr>
     </w:tbl>
-    <w:bookmarkEnd w:id="31"/>
+    <w:bookmarkEnd w:id="32"/>
     <w:sectPr>
       <w:footnotePr>
         <w:numRestart w:val="eachSect"/>

</xml_diff>

<commit_message>
docs(orgcomp): cite FedRAMP's actual PAIN-rating SLA model in Books 03/06/07 (#1383)
"SLA class keyed to KEV/exposure" was gesturing at CISA BOD 26-04 without
citing what FedRAMP actually specifies. FedRAMP's Vulnerability Detection
and Response ruleset (VDR-TFR-PVR) names a concrete model — remediation
timeframes by Potential Agency Impact (PAIN) rating crossed with
exploitability and internet-reachability, 4 to 192 days depending on the
cell. Replace the vague "four-variable model" phrasing with the actual
table in all three CSP books' Engine 2/3 sections and References, and
fix two more stale "OCI and VMware" cross-references in Book 06 that
should have been updated when Book 07 shipped.

Co-authored-by: Claude Sonnet 5 <noreply@anthropic.com>
</commit_message>
<xml_diff>
--- a/docs/customer-documents/orgcomp-series/Vol_VII_Book_03_OrgComp_Azure_Control_Compliance_Automation.docx
+++ b/docs/customer-documents/orgcomp-series/Vol_VII_Book_03_OrgComp_Azure_Control_Compliance_Automation.docx
@@ -7,7 +7,7 @@
         <w:pStyle w:val="Title"/>
       </w:pPr>
       <w:r>
-        <w:t xml:space="preserve">Vol VII Book 03 — Federal Application-Aware Networking — Azure Federal Control Compliance Automation</w:t>
+        <w:t xml:space="preserve">Vol VII Book 03 — Federal Organization Compliance — Azure Federal Control Compliance Automation</w:t>
       </w:r>
     </w:p>
     <w:p>
@@ -23,7 +23,7 @@
         <w:pStyle w:val="Author"/>
       </w:pPr>
       <w:r>
-        <w:t xml:space="preserve">SSA Cloud Services Team</w:t>
+        <w:t xml:space="preserve">Federal Cloud Services</w:t>
       </w:r>
     </w:p>
     <w:p>
@@ -31,7 +31,7 @@
         <w:pStyle w:val="Date"/>
       </w:pPr>
       <w:r>
-        <w:t xml:space="preserve">2026-07-12 15:00 ET</w:t>
+        <w:t xml:space="preserve">2026-07-28 08:45 ET</w:t>
       </w:r>
     </w:p>
     <w:p>
@@ -69,7 +69,7 @@
         <w:t xml:space="preserve">CSI Team (Cloud Services Infrastructure)</w:t>
       </w:r>
       <w:r>
-        <w:t xml:space="preserve">; not yet reviewed or approved by the SSA CIO Office, OIS, or leadership.</w:t>
+        <w:t xml:space="preserve">; not yet reviewed or approved by the {{&lt; meta agency.short &gt;}} CIO Office, OIS, or leadership.</w:t>
       </w:r>
       <w:r>
         <w:t xml:space="preserve"> </w:t>
@@ -85,7 +85,7 @@
         <w:t xml:space="preserve"> </w:t>
       </w:r>
       <w:r>
-        <w:t xml:space="preserve">2026-07-12 15:00 ET</w:t>
+        <w:t xml:space="preserve">2026-07-28 08:45 ET</w:t>
       </w:r>
     </w:p>
     <w:bookmarkEnd w:id="9"/>
@@ -517,13 +517,13 @@
           <w:b/>
           <w:bCs/>
         </w:rPr>
-        <w:t xml:space="preserve">Other CSPs (AWS, OCI, VMware) reconcile into the same ServiceNow SI-2 queue in a later follow-up</w:t>
-      </w:r>
-      <w:r>
-        <w:t xml:space="preserve"> </w:t>
-      </w:r>
-      <w:r>
-        <w:t xml:space="preserve">(their native stacks are catalogued in Vol III Book 03); ServiceNow already coordinates a single queue, so adding those surfaces later needs no rework here.</w:t>
+        <w:t xml:space="preserve">AWS’s own engines are covered in Vol VII Book 06, VMware’s in Vol VII Book 07; OCI reconciles into the same ServiceNow SI-2 queue in a later follow-up</w:t>
+      </w:r>
+      <w:r>
+        <w:t xml:space="preserve"> </w:t>
+      </w:r>
+      <w:r>
+        <w:t xml:space="preserve">(its native stack is catalogued in Vol III Book 03); ServiceNow already coordinates a single queue, so adding that surface later needs no rework here.</w:t>
       </w:r>
     </w:p>
     <w:bookmarkEnd w:id="15"/>
@@ -739,7 +739,7 @@
         <w:t xml:space="preserve"> </w:t>
       </w:r>
       <w:r>
-        <w:t xml:space="preserve">task against the reconciled CI, with a severity and an SLA class derived from exposure and KEV status — the risk-based prioritization CISA BOD 22-01 and the four-variable model (BOD 26-04) call for.</w:t>
+        <w:t xml:space="preserve">task against the reconciled CI, with a severity and an SLA class derived from exposure and KEV status — the risk-based prioritization CISA BOD 22-01 and the PAIN-rating model (BOD 26-04; FedRAMP VDR-TFR-PVR) call for, detailed under Control Engine 3 below.</w:t>
       </w:r>
     </w:p>
     <w:p>
@@ -877,7 +877,7 @@
         <w:t xml:space="preserve"> </w:t>
       </w:r>
       <w:r>
-        <w:t xml:space="preserve">(an out-of-cycle KEV exposure), with an SLA class keyed to KEV/exposure — the BOD 26-04 model. The same SLA discipline is what other-CSP patch queues will reconcile into when they are added later (Vol III Book 03).</w:t>
+        <w:t xml:space="preserve">(an out-of-cycle KEV exposure), with an SLA class keyed to KEV/exposure — the PAIN-rating model (BOD 26-04; FedRAMP VDR-TFR-PVR), detailed below. The same SLA discipline is what other-CSP patch queues will reconcile into when they are added later (Vol III Book 03).</w:t>
       </w:r>
     </w:p>
     <w:p>
@@ -933,6 +933,305 @@
           <w:b/>
           <w:bCs/>
         </w:rPr>
+        <w:t xml:space="preserve">“SLA by exposure”</w:t>
+      </w:r>
+      <w:r>
+        <w:rPr>
+          <w:b/>
+          <w:bCs/>
+        </w:rPr>
+        <w:t xml:space="preserve"> </w:t>
+      </w:r>
+      <w:r>
+        <w:rPr>
+          <w:b/>
+          <w:bCs/>
+        </w:rPr>
+        <w:t xml:space="preserve">has a name and a published table — the Potential Agency Impact (PAIN) rating.</w:t>
+      </w:r>
+      <w:r>
+        <w:t xml:space="preserve"> </w:t>
+      </w:r>
+      <w:r>
+        <w:t xml:space="preserve">FedRAMP’s Vulnerability Detection and Response ruleset (VDR-TFR-PVR) sets mitigation/remediation timeframes by PAIN rating crossed with exploitability and internet-reachability:</w:t>
+      </w:r>
+    </w:p>
+    <w:tbl>
+      <w:tblPr>
+        <w:tblStyle w:val="Table"/>
+        <w:tblW w:type="pct" w:w="5000"/>
+        <w:tblLayout w:type="fixed"/>
+        <w:tblLook w:firstRow="1" w:lastRow="0" w:firstColumn="0" w:lastColumn="0" w:noHBand="0" w:noVBand="0" w:val="0020"/>
+      </w:tblPr>
+      <w:tblGrid>
+        <w:gridCol w:w="1980"/>
+        <w:gridCol w:w="1980"/>
+        <w:gridCol w:w="1980"/>
+        <w:gridCol w:w="1980"/>
+      </w:tblGrid>
+      <w:tr>
+        <w:trPr>
+          <w:tblHeader w:val="on"/>
+        </w:trPr>
+        <w:tc>
+          <w:tcPr/>
+          <w:p>
+            <w:pPr>
+              <w:pStyle w:val="Compact"/>
+            </w:pPr>
+            <w:r>
+              <w:t xml:space="preserve">PAIN rating</w:t>
+            </w:r>
+          </w:p>
+        </w:tc>
+        <w:tc>
+          <w:tcPr/>
+          <w:p>
+            <w:pPr>
+              <w:pStyle w:val="Compact"/>
+            </w:pPr>
+            <w:r>
+              <w:t xml:space="preserve">Likely-exploitable, internet-reachable</w:t>
+            </w:r>
+          </w:p>
+        </w:tc>
+        <w:tc>
+          <w:tcPr/>
+          <w:p>
+            <w:pPr>
+              <w:pStyle w:val="Compact"/>
+            </w:pPr>
+            <w:r>
+              <w:t xml:space="preserve">Likely-exploitable, not internet-reachable</w:t>
+            </w:r>
+          </w:p>
+        </w:tc>
+        <w:tc>
+          <w:tcPr/>
+          <w:p>
+            <w:pPr>
+              <w:pStyle w:val="Compact"/>
+            </w:pPr>
+            <w:r>
+              <w:t xml:space="preserve">Not likely exploitable</w:t>
+            </w:r>
+          </w:p>
+        </w:tc>
+      </w:tr>
+      <w:tr>
+        <w:tc>
+          <w:tcPr/>
+          <w:p>
+            <w:pPr>
+              <w:pStyle w:val="Compact"/>
+            </w:pPr>
+            <w:r>
+              <w:t xml:space="preserve">PAIN-5</w:t>
+            </w:r>
+          </w:p>
+        </w:tc>
+        <w:tc>
+          <w:tcPr/>
+          <w:p>
+            <w:pPr>
+              <w:pStyle w:val="Compact"/>
+            </w:pPr>
+            <w:r>
+              <w:t xml:space="preserve">4 days</w:t>
+            </w:r>
+          </w:p>
+        </w:tc>
+        <w:tc>
+          <w:tcPr/>
+          <w:p>
+            <w:pPr>
+              <w:pStyle w:val="Compact"/>
+            </w:pPr>
+            <w:r>
+              <w:t xml:space="preserve">8 days</w:t>
+            </w:r>
+          </w:p>
+        </w:tc>
+        <w:tc>
+          <w:tcPr/>
+          <w:p>
+            <w:pPr>
+              <w:pStyle w:val="Compact"/>
+            </w:pPr>
+            <w:r>
+              <w:t xml:space="preserve">32 days</w:t>
+            </w:r>
+          </w:p>
+        </w:tc>
+      </w:tr>
+      <w:tr>
+        <w:tc>
+          <w:tcPr/>
+          <w:p>
+            <w:pPr>
+              <w:pStyle w:val="Compact"/>
+            </w:pPr>
+            <w:r>
+              <w:t xml:space="preserve">PAIN-4</w:t>
+            </w:r>
+          </w:p>
+        </w:tc>
+        <w:tc>
+          <w:tcPr/>
+          <w:p>
+            <w:pPr>
+              <w:pStyle w:val="Compact"/>
+            </w:pPr>
+            <w:r>
+              <w:t xml:space="preserve">8 days</w:t>
+            </w:r>
+          </w:p>
+        </w:tc>
+        <w:tc>
+          <w:tcPr/>
+          <w:p>
+            <w:pPr>
+              <w:pStyle w:val="Compact"/>
+            </w:pPr>
+            <w:r>
+              <w:t xml:space="preserve">32 days</w:t>
+            </w:r>
+          </w:p>
+        </w:tc>
+        <w:tc>
+          <w:tcPr/>
+          <w:p>
+            <w:pPr>
+              <w:pStyle w:val="Compact"/>
+            </w:pPr>
+            <w:r>
+              <w:t xml:space="preserve">64 days</w:t>
+            </w:r>
+          </w:p>
+        </w:tc>
+      </w:tr>
+      <w:tr>
+        <w:tc>
+          <w:tcPr/>
+          <w:p>
+            <w:pPr>
+              <w:pStyle w:val="Compact"/>
+            </w:pPr>
+            <w:r>
+              <w:t xml:space="preserve">PAIN-3</w:t>
+            </w:r>
+          </w:p>
+        </w:tc>
+        <w:tc>
+          <w:tcPr/>
+          <w:p>
+            <w:pPr>
+              <w:pStyle w:val="Compact"/>
+            </w:pPr>
+            <w:r>
+              <w:t xml:space="preserve">32 days</w:t>
+            </w:r>
+          </w:p>
+        </w:tc>
+        <w:tc>
+          <w:tcPr/>
+          <w:p>
+            <w:pPr>
+              <w:pStyle w:val="Compact"/>
+            </w:pPr>
+            <w:r>
+              <w:t xml:space="preserve">64 days</w:t>
+            </w:r>
+          </w:p>
+        </w:tc>
+        <w:tc>
+          <w:tcPr/>
+          <w:p>
+            <w:pPr>
+              <w:pStyle w:val="Compact"/>
+            </w:pPr>
+            <w:r>
+              <w:t xml:space="preserve">192 days</w:t>
+            </w:r>
+          </w:p>
+        </w:tc>
+      </w:tr>
+      <w:tr>
+        <w:tc>
+          <w:tcPr/>
+          <w:p>
+            <w:pPr>
+              <w:pStyle w:val="Compact"/>
+            </w:pPr>
+            <w:r>
+              <w:t xml:space="preserve">PAIN-2</w:t>
+            </w:r>
+          </w:p>
+        </w:tc>
+        <w:tc>
+          <w:tcPr/>
+          <w:p>
+            <w:pPr>
+              <w:pStyle w:val="Compact"/>
+            </w:pPr>
+            <w:r>
+              <w:t xml:space="preserve">96 days</w:t>
+            </w:r>
+          </w:p>
+        </w:tc>
+        <w:tc>
+          <w:tcPr/>
+          <w:p>
+            <w:pPr>
+              <w:pStyle w:val="Compact"/>
+            </w:pPr>
+            <w:r>
+              <w:t xml:space="preserve">160 days</w:t>
+            </w:r>
+          </w:p>
+        </w:tc>
+        <w:tc>
+          <w:tcPr/>
+          <w:p>
+            <w:pPr>
+              <w:pStyle w:val="Compact"/>
+            </w:pPr>
+            <w:r>
+              <w:t xml:space="preserve">192 days</w:t>
+            </w:r>
+          </w:p>
+        </w:tc>
+      </w:tr>
+    </w:tbl>
+    <w:p>
+      <w:pPr>
+        <w:pStyle w:val="CalloutNote"/>
+      </w:pPr>
+      <w:r>
+        <w:t xml:space="preserve">A CISA-catalogued KEV must be remediated by the KEV catalog’s own due date regardless of PAIN rating (VDR-TFR-KEV), even after full mitigation. These are the actual numbers a ServiceNow SLA-class task should encode —</w:t>
+      </w:r>
+      <w:r>
+        <w:t xml:space="preserve"> </w:t>
+      </w:r>
+      <w:r>
+        <w:t xml:space="preserve">“SLA by exposure”</w:t>
+      </w:r>
+      <w:r>
+        <w:t xml:space="preserve"> </w:t>
+      </w:r>
+      <w:r>
+        <w:t xml:space="preserve">is this table, not a general-purpose severity field.</w:t>
+      </w:r>
+    </w:p>
+    <w:p>
+      <w:pPr>
+        <w:pStyle w:val="CalloutNote"/>
+      </w:pPr>
+      <w:r>
+        <w:rPr>
+          <w:b/>
+          <w:bCs/>
+        </w:rPr>
         <w:t xml:space="preserve">Scan is not remediation, and remediation is not the record.</w:t>
       </w:r>
       <w:r>
@@ -1082,7 +1381,7 @@
         <w:rPr>
           <w:rStyle w:val="VerbatimChar"/>
         </w:rPr>
-        <w:t xml:space="preserve">aan-compliance-spine.yml</w:t>
+        <w:t xml:space="preserve">orgcomp-compliance-spine.yml</w:t>
       </w:r>
       <w:r>
         <w:t xml:space="preserve">) by</w:t>
@@ -1719,7 +2018,7 @@
       </w:r>
     </w:p>
     <w:bookmarkEnd w:id="25"/>
-    <w:bookmarkStart w:id="31" w:name="references"/>
+    <w:bookmarkStart w:id="32" w:name="references"/>
     <w:p>
       <w:pPr>
         <w:pStyle w:val="Heading1"/>
@@ -1914,7 +2213,7 @@
               <w:pStyle w:val="Compact"/>
             </w:pPr>
             <w:r>
-              <w:t xml:space="preserve">Risk-based remediation prioritization (KEV; four-variable model)</w:t>
+              <w:t xml:space="preserve">Risk-based remediation prioritization (KEV catalog)</w:t>
             </w:r>
           </w:p>
         </w:tc>
@@ -1949,6 +2248,41 @@
               <w:pStyle w:val="Compact"/>
             </w:pPr>
             <w:r>
+              <w:t xml:space="preserve">PAIN-rating remediation timeframes (VDR-TFR-PVR)</w:t>
+            </w:r>
+          </w:p>
+        </w:tc>
+        <w:tc>
+          <w:tcPr/>
+          <w:p>
+            <w:pPr>
+              <w:pStyle w:val="Compact"/>
+            </w:pPr>
+            <w:r>
+              <w:t xml:space="preserve">FedRAMP —</w:t>
+            </w:r>
+            <w:r>
+              <w:t xml:space="preserve"> </w:t>
+            </w:r>
+            <w:hyperlink r:id="rId31">
+              <w:r>
+                <w:rPr>
+                  <w:rStyle w:val="Hyperlink"/>
+                </w:rPr>
+                <w:t xml:space="preserve">https://www.fedramp.gov/2026/reference/vulnerability-detection-and-response/</w:t>
+              </w:r>
+            </w:hyperlink>
+          </w:p>
+        </w:tc>
+      </w:tr>
+      <w:tr>
+        <w:tc>
+          <w:tcPr/>
+          <w:p>
+            <w:pPr>
+              <w:pStyle w:val="Compact"/>
+            </w:pPr>
+            <w:r>
               <w:t xml:space="preserve">ServiceNow as workflow/CMDB/evidence coordination hub</w:t>
             </w:r>
           </w:p>
@@ -1969,13 +2303,13 @@
               <w:rPr>
                 <w:rStyle w:val="VerbatimChar"/>
               </w:rPr>
-              <w:t xml:space="preserve">inbox/Application Aware Networking/AAN_Series_Expansion_Plan_Substrate_Accreditation.md</w:t>
+              <w:t xml:space="preserve">docs/customer-documents/orgcomp-series/OrgComp_Series_Expansion_Plan_Substrate_Accreditation.md</w:t>
             </w:r>
           </w:p>
         </w:tc>
       </w:tr>
     </w:tbl>
-    <w:bookmarkEnd w:id="31"/>
+    <w:bookmarkEnd w:id="32"/>
     <w:sectPr>
       <w:footnotePr>
         <w:numRestart w:val="eachSect"/>

</xml_diff>